<commit_message>
4.	ML Models analysis added in word plus updated Jupiter notebook
</commit_message>
<xml_diff>
--- a/Daniel_Marciniak_ML_HDipData_Sept26_PT.docx
+++ b/Daniel_Marciniak_ML_HDipData_Sept26_PT.docx
@@ -69,7 +69,7 @@
             </w:rPr>
             <w:fldChar w:fldCharType="separate"/>
           </w:r>
-          <w:hyperlink w:anchor="_Toc243936419" w:history="1">
+          <w:hyperlink w:anchor="_Toc244198961" w:history="1">
             <w:r>
               <w:rPr>
                 <w:rStyle w:val="Hyperlink"/>
@@ -115,7 +115,7 @@
                 <w:noProof/>
                 <w:webHidden/>
               </w:rPr>
-              <w:instrText xml:space="preserve"> PAGEREF _Toc243936419 \h </w:instrText>
+              <w:instrText xml:space="preserve"> PAGEREF _Toc244198961 \h </w:instrText>
             </w:r>
             <w:r>
               <w:rPr>
@@ -163,7 +163,7 @@
               <w:lang w:eastAsia="en-GB"/>
             </w:rPr>
           </w:pPr>
-          <w:hyperlink w:anchor="_Toc243936420" w:history="1">
+          <w:hyperlink w:anchor="_Toc244198962" w:history="1">
             <w:r>
               <w:rPr>
                 <w:rStyle w:val="Hyperlink"/>
@@ -209,7 +209,7 @@
                 <w:noProof/>
                 <w:webHidden/>
               </w:rPr>
-              <w:instrText xml:space="preserve"> PAGEREF _Toc243936420 \h </w:instrText>
+              <w:instrText xml:space="preserve"> PAGEREF _Toc244198962 \h </w:instrText>
             </w:r>
             <w:r>
               <w:rPr>
@@ -257,7 +257,7 @@
               <w:lang w:eastAsia="en-GB"/>
             </w:rPr>
           </w:pPr>
-          <w:hyperlink w:anchor="_Toc243936421" w:history="1">
+          <w:hyperlink w:anchor="_Toc244198963" w:history="1">
             <w:r>
               <w:rPr>
                 <w:rStyle w:val="Hyperlink"/>
@@ -303,7 +303,7 @@
                 <w:noProof/>
                 <w:webHidden/>
               </w:rPr>
-              <w:instrText xml:space="preserve"> PAGEREF _Toc243936421 \h </w:instrText>
+              <w:instrText xml:space="preserve"> PAGEREF _Toc244198963 \h </w:instrText>
             </w:r>
             <w:r>
               <w:rPr>
@@ -324,6 +324,194 @@
                 <w:webHidden/>
               </w:rPr>
               <w:t>2</w:t>
+            </w:r>
+            <w:r>
+              <w:rPr>
+                <w:noProof/>
+                <w:webHidden/>
+              </w:rPr>
+              <w:fldChar w:fldCharType="end"/>
+            </w:r>
+          </w:hyperlink>
+        </w:p>
+        <w:p>
+          <w:pPr>
+            <w:pStyle w:val="TOC1"/>
+            <w:tabs>
+              <w:tab w:val="left" w:pos="480"/>
+              <w:tab w:val="right" w:leader="dot" w:pos="9016"/>
+            </w:tabs>
+            <w:rPr>
+              <w:rFonts w:eastAsiaTheme="minorEastAsia"/>
+              <w:b w:val="0"/>
+              <w:bCs w:val="0"/>
+              <w:i w:val="0"/>
+              <w:iCs w:val="0"/>
+              <w:noProof/>
+              <w:lang w:eastAsia="en-GB"/>
+            </w:rPr>
+          </w:pPr>
+          <w:hyperlink w:anchor="_Toc244198964" w:history="1">
+            <w:r>
+              <w:rPr>
+                <w:rStyle w:val="Hyperlink"/>
+                <w:noProof/>
+              </w:rPr>
+              <w:t>4.</w:t>
+            </w:r>
+            <w:r>
+              <w:rPr>
+                <w:rFonts w:eastAsiaTheme="minorEastAsia"/>
+                <w:b w:val="0"/>
+                <w:bCs w:val="0"/>
+                <w:i w:val="0"/>
+                <w:iCs w:val="0"/>
+                <w:noProof/>
+                <w:lang w:eastAsia="en-GB"/>
+              </w:rPr>
+              <w:tab/>
+            </w:r>
+            <w:r>
+              <w:rPr>
+                <w:rStyle w:val="Hyperlink"/>
+                <w:noProof/>
+              </w:rPr>
+              <w:t>ML Models</w:t>
+            </w:r>
+            <w:r>
+              <w:rPr>
+                <w:noProof/>
+                <w:webHidden/>
+              </w:rPr>
+              <w:tab/>
+            </w:r>
+            <w:r>
+              <w:rPr>
+                <w:noProof/>
+                <w:webHidden/>
+              </w:rPr>
+              <w:fldChar w:fldCharType="begin"/>
+            </w:r>
+            <w:r>
+              <w:rPr>
+                <w:noProof/>
+                <w:webHidden/>
+              </w:rPr>
+              <w:instrText xml:space="preserve"> PAGEREF _Toc244198964 \h </w:instrText>
+            </w:r>
+            <w:r>
+              <w:rPr>
+                <w:noProof/>
+                <w:webHidden/>
+              </w:rPr>
+            </w:r>
+            <w:r>
+              <w:rPr>
+                <w:noProof/>
+                <w:webHidden/>
+              </w:rPr>
+              <w:fldChar w:fldCharType="separate"/>
+            </w:r>
+            <w:r>
+              <w:rPr>
+                <w:noProof/>
+                <w:webHidden/>
+              </w:rPr>
+              <w:t>2</w:t>
+            </w:r>
+            <w:r>
+              <w:rPr>
+                <w:noProof/>
+                <w:webHidden/>
+              </w:rPr>
+              <w:fldChar w:fldCharType="end"/>
+            </w:r>
+          </w:hyperlink>
+        </w:p>
+        <w:p>
+          <w:pPr>
+            <w:pStyle w:val="TOC1"/>
+            <w:tabs>
+              <w:tab w:val="left" w:pos="480"/>
+              <w:tab w:val="right" w:leader="dot" w:pos="9016"/>
+            </w:tabs>
+            <w:rPr>
+              <w:rFonts w:eastAsiaTheme="minorEastAsia"/>
+              <w:b w:val="0"/>
+              <w:bCs w:val="0"/>
+              <w:i w:val="0"/>
+              <w:iCs w:val="0"/>
+              <w:noProof/>
+              <w:lang w:eastAsia="en-GB"/>
+            </w:rPr>
+          </w:pPr>
+          <w:hyperlink w:anchor="_Toc244198965" w:history="1">
+            <w:r>
+              <w:rPr>
+                <w:rStyle w:val="Hyperlink"/>
+                <w:noProof/>
+              </w:rPr>
+              <w:t>5.</w:t>
+            </w:r>
+            <w:r>
+              <w:rPr>
+                <w:rFonts w:eastAsiaTheme="minorEastAsia"/>
+                <w:b w:val="0"/>
+                <w:bCs w:val="0"/>
+                <w:i w:val="0"/>
+                <w:iCs w:val="0"/>
+                <w:noProof/>
+                <w:lang w:eastAsia="en-GB"/>
+              </w:rPr>
+              <w:tab/>
+            </w:r>
+            <w:r>
+              <w:rPr>
+                <w:rStyle w:val="Hyperlink"/>
+                <w:noProof/>
+              </w:rPr>
+              <w:t>Data splits and cross-validation</w:t>
+            </w:r>
+            <w:r>
+              <w:rPr>
+                <w:noProof/>
+                <w:webHidden/>
+              </w:rPr>
+              <w:tab/>
+            </w:r>
+            <w:r>
+              <w:rPr>
+                <w:noProof/>
+                <w:webHidden/>
+              </w:rPr>
+              <w:fldChar w:fldCharType="begin"/>
+            </w:r>
+            <w:r>
+              <w:rPr>
+                <w:noProof/>
+                <w:webHidden/>
+              </w:rPr>
+              <w:instrText xml:space="preserve"> PAGEREF _Toc244198965 \h </w:instrText>
+            </w:r>
+            <w:r>
+              <w:rPr>
+                <w:noProof/>
+                <w:webHidden/>
+              </w:rPr>
+            </w:r>
+            <w:r>
+              <w:rPr>
+                <w:noProof/>
+                <w:webHidden/>
+              </w:rPr>
+              <w:fldChar w:fldCharType="separate"/>
+            </w:r>
+            <w:r>
+              <w:rPr>
+                <w:noProof/>
+                <w:webHidden/>
+              </w:rPr>
+              <w:t>3</w:t>
             </w:r>
             <w:r>
               <w:rPr>
@@ -359,7 +547,7 @@
           <w:numId w:val="3"/>
         </w:numPr>
       </w:pPr>
-      <w:bookmarkStart w:id="0" w:name="_Toc243936419"/>
+      <w:bookmarkStart w:id="0" w:name="_Toc244198961"/>
       <w:r>
         <w:t>Scope</w:t>
       </w:r>
@@ -465,7 +653,7 @@
           <w:numId w:val="3"/>
         </w:numPr>
       </w:pPr>
-      <w:bookmarkStart w:id="1" w:name="_Toc243936420"/>
+      <w:bookmarkStart w:id="1" w:name="_Toc244198962"/>
       <w:r>
         <w:t>Introduction</w:t>
       </w:r>
@@ -485,7 +673,11 @@
         <w:t>data from Taiwan.</w:t>
       </w:r>
       <w:r>
-        <w:t xml:space="preserve"> I believe that prediction of real estate prices may result in good</w:t>
+        <w:t xml:space="preserve"> I believe that prediction of </w:t>
+      </w:r>
+      <w:r>
+        <w:lastRenderedPageBreak/>
+        <w:t>real estate prices may result in good</w:t>
       </w:r>
       <w:r>
         <w:t xml:space="preserve">  and proper future investments in estate. I hope ML will meet these data and the result.</w:t>
@@ -496,7 +688,6 @@
         <w:ind w:left="360" w:firstLine="360"/>
       </w:pPr>
       <w:r>
-        <w:lastRenderedPageBreak/>
         <w:t xml:space="preserve"> My original file contains columns named: ‘No</w:t>
       </w:r>
       <w:r>
@@ -573,7 +764,7 @@
           <w:numId w:val="3"/>
         </w:numPr>
       </w:pPr>
-      <w:bookmarkStart w:id="2" w:name="_Toc243936421"/>
+      <w:bookmarkStart w:id="2" w:name="_Toc244198963"/>
       <w:r>
         <w:t>Dataset Preparation</w:t>
       </w:r>
@@ -603,6 +794,141 @@
       <w:r>
         <w:t xml:space="preserve"> The corelation shows that the metro station distance reflects -0.67 with the unit are price. The amount of convenience shops has kind of strong relationship 0.57 with the target. The fields related to location might have much more important effect on the price – target.</w:t>
       </w:r>
+    </w:p>
+    <w:p/>
+    <w:p>
+      <w:pPr>
+        <w:pStyle w:val="Heading1"/>
+        <w:numPr>
+          <w:ilvl w:val="0"/>
+          <w:numId w:val="3"/>
+        </w:numPr>
+      </w:pPr>
+      <w:bookmarkStart w:id="3" w:name="_Toc244198964"/>
+      <w:r>
+        <w:t>ML Models</w:t>
+      </w:r>
+      <w:bookmarkEnd w:id="3"/>
+    </w:p>
+    <w:p>
+      <w:pPr>
+        <w:ind w:firstLine="360"/>
+      </w:pPr>
+      <w:r>
+        <w:t>In the linear regression model</w:t>
+      </w:r>
+      <w:r>
+        <w:t xml:space="preserve"> </w:t>
+      </w:r>
+      <w:r>
+        <w:t xml:space="preserve">the mean squared error gives 69.67. This outcome shows average squared difference between the actual prices and predicted ones. Lower values show smaller errors  when comparing models. </w:t>
+      </w:r>
+      <w:r>
+        <w:t>The r</w:t>
+      </w:r>
+      <w:r>
+        <w:t>-squared score was 8.35</w:t>
+      </w:r>
+      <w:r>
+        <w:t xml:space="preserve"> - </w:t>
+      </w:r>
+      <w:r>
+        <w:t>RMSE treats larger errors more heavily.</w:t>
+      </w:r>
+      <w:r>
+        <w:t xml:space="preserve"> </w:t>
+      </w:r>
+      <w:r>
+        <w:t xml:space="preserve"> </w:t>
+      </w:r>
+      <w:r>
+        <w:t>R² = 0.648</w:t>
+      </w:r>
+      <w:r>
+        <w:t xml:space="preserve"> - m</w:t>
+      </w:r>
+      <w:r>
+        <w:t>odel explains 64.8% of the  variations  in prices in the test section.</w:t>
+      </w:r>
+    </w:p>
+    <w:p>
+      <w:pPr>
+        <w:ind w:firstLine="360"/>
+      </w:pPr>
+      <w:r>
+        <w:t xml:space="preserve">In the random forest regressor the mean squared error reflects less than for the linear regression – 38.19. The  The prediction error scale is 6.18, which is smaller than for the previous model. </w:t>
+      </w:r>
+      <w:r>
+        <w:t>R² = 0.807</w:t>
+      </w:r>
+      <w:r>
+        <w:t>. -</w:t>
+      </w:r>
+      <w:r>
+        <w:t xml:space="preserve">- model explains </w:t>
+      </w:r>
+      <w:r>
+        <w:t>80.7</w:t>
+      </w:r>
+      <w:r>
+        <w:t>%</w:t>
+      </w:r>
+      <w:r>
+        <w:t xml:space="preserve"> </w:t>
+      </w:r>
+      <w:r>
+        <w:t xml:space="preserve"> of the  variations  in prices in the test section.</w:t>
+      </w:r>
+    </w:p>
+    <w:p>
+      <w:pPr>
+        <w:ind w:firstLine="360"/>
+      </w:pPr>
+      <w:r>
+        <w:lastRenderedPageBreak/>
+        <w:t>The  better choice between those two models will be the random forest .</w:t>
+      </w:r>
+      <w:r>
+        <w:t xml:space="preserve"> It predicted a higher </w:t>
+      </w:r>
+      <w:r>
+        <w:t>R²</w:t>
+      </w:r>
+      <w:r>
+        <w:t xml:space="preserve"> score and lower RMSE  and MSE. As a result, the random forest predicted house prices with better accuracy. The linear regression seems to be easier for an interpretation, the random forest is more suitable for the complex relationships. In my further research.</w:t>
+      </w:r>
+    </w:p>
+    <w:p>
+      <w:pPr>
+        <w:pStyle w:val="Heading1"/>
+        <w:numPr>
+          <w:ilvl w:val="0"/>
+          <w:numId w:val="3"/>
+        </w:numPr>
+      </w:pPr>
+      <w:bookmarkStart w:id="4" w:name="_Toc244198965"/>
+      <w:r>
+        <w:t>D</w:t>
+      </w:r>
+      <w:r>
+        <w:t>ata splits and cross-validation</w:t>
+      </w:r>
+      <w:bookmarkEnd w:id="4"/>
+    </w:p>
+    <w:p>
+      <w:pPr>
+        <w:ind w:firstLine="360"/>
+      </w:pPr>
+    </w:p>
+    <w:p>
+      <w:pPr>
+        <w:ind w:firstLine="360"/>
+      </w:pPr>
+    </w:p>
+    <w:p>
+      <w:pPr>
+        <w:ind w:left="360"/>
+      </w:pPr>
     </w:p>
     <w:sectPr>
       <w:pgSz w:w="11906" w:h="16838"/>
@@ -1522,7 +1848,6 @@
   <w:style w:type="character" w:default="1" w:styleId="DefaultParagraphFont">
     <w:name w:val="Default Paragraph Font"/>
     <w:uiPriority w:val="1"/>
-    <w:semiHidden/>
     <w:unhideWhenUsed/>
   </w:style>
   <w:style w:type="table" w:default="1" w:styleId="TableNormal">

</xml_diff>